<commit_message>
Improve table formatting in logsheet generation script
Co-authored-by: aashrikaac <aashrikaac@gmail.com>
</commit_message>
<xml_diff>
--- a/medilog/MediLog_Logsheet_Continuation.docx
+++ b/medilog/MediLog_Logsheet_Continuation.docx
@@ -32,6 +32,7 @@
       <w:tblPr>
         <w:tblStyle w:val="TableGrid"/>
         <w:tblW w:type="auto" w:w="0"/>
+        <w:tblLayout w:type="fixed"/>
         <w:tblLook w:firstColumn="1" w:firstRow="1" w:lastColumn="0" w:lastRow="0" w:noHBand="0" w:noVBand="1" w:val="04A0"/>
       </w:tblPr>
       <w:tblGrid>
@@ -47,36 +48,48 @@
           </w:tcPr>
           <w:p>
             <w:r>
+              <w:rPr>
+                <w:b/>
+              </w:rPr>
               <w:t>Week</w:t>
             </w:r>
           </w:p>
         </w:tc>
         <w:tc>
           <w:tcPr>
-            <w:tcW w:type="dxa" w:w="2160"/>
+            <w:tcW w:type="dxa" w:w="2592"/>
           </w:tcPr>
           <w:p>
             <w:r>
+              <w:rPr>
+                <w:b/>
+              </w:rPr>
               <w:t>Activity Planned</w:t>
             </w:r>
           </w:p>
         </w:tc>
         <w:tc>
           <w:tcPr>
-            <w:tcW w:type="dxa" w:w="2160"/>
+            <w:tcW w:type="dxa" w:w="3888"/>
           </w:tcPr>
           <w:p>
             <w:r>
+              <w:rPr>
+                <w:b/>
+              </w:rPr>
               <w:t>Activity Done</w:t>
             </w:r>
           </w:p>
         </w:tc>
         <w:tc>
           <w:tcPr>
-            <w:tcW w:type="dxa" w:w="2160"/>
+            <w:tcW w:type="dxa" w:w="720"/>
           </w:tcPr>
           <w:p>
             <w:r>
+              <w:rPr>
+                <w:b/>
+              </w:rPr>
               <w:t>Time Spent (hrs)</w:t>
             </w:r>
           </w:p>
@@ -95,7 +108,7 @@
         </w:tc>
         <w:tc>
           <w:tcPr>
-            <w:tcW w:type="dxa" w:w="2160"/>
+            <w:tcW w:type="dxa" w:w="2592"/>
           </w:tcPr>
           <w:p>
             <w:r>
@@ -105,7 +118,7 @@
         </w:tc>
         <w:tc>
           <w:tcPr>
-            <w:tcW w:type="dxa" w:w="2160"/>
+            <w:tcW w:type="dxa" w:w="3888"/>
           </w:tcPr>
           <w:p>
             <w:r>
@@ -115,9 +128,12 @@
         </w:tc>
         <w:tc>
           <w:tcPr>
-            <w:tcW w:type="dxa" w:w="2160"/>
+            <w:tcW w:type="dxa" w:w="720"/>
           </w:tcPr>
           <w:p>
+            <w:pPr>
+              <w:jc w:val="center"/>
+            </w:pPr>
             <w:r>
               <w:t>10</w:t>
             </w:r>
@@ -137,7 +153,7 @@
         </w:tc>
         <w:tc>
           <w:tcPr>
-            <w:tcW w:type="dxa" w:w="2160"/>
+            <w:tcW w:type="dxa" w:w="2592"/>
           </w:tcPr>
           <w:p>
             <w:r>
@@ -147,7 +163,7 @@
         </w:tc>
         <w:tc>
           <w:tcPr>
-            <w:tcW w:type="dxa" w:w="2160"/>
+            <w:tcW w:type="dxa" w:w="3888"/>
           </w:tcPr>
           <w:p>
             <w:r>
@@ -157,9 +173,12 @@
         </w:tc>
         <w:tc>
           <w:tcPr>
-            <w:tcW w:type="dxa" w:w="2160"/>
+            <w:tcW w:type="dxa" w:w="720"/>
           </w:tcPr>
           <w:p>
+            <w:pPr>
+              <w:jc w:val="center"/>
+            </w:pPr>
             <w:r>
               <w:t>20</w:t>
             </w:r>
@@ -179,7 +198,7 @@
         </w:tc>
         <w:tc>
           <w:tcPr>
-            <w:tcW w:type="dxa" w:w="2160"/>
+            <w:tcW w:type="dxa" w:w="2592"/>
           </w:tcPr>
           <w:p>
             <w:r>
@@ -189,7 +208,7 @@
         </w:tc>
         <w:tc>
           <w:tcPr>
-            <w:tcW w:type="dxa" w:w="2160"/>
+            <w:tcW w:type="dxa" w:w="3888"/>
           </w:tcPr>
           <w:p>
             <w:r>
@@ -199,9 +218,12 @@
         </w:tc>
         <w:tc>
           <w:tcPr>
-            <w:tcW w:type="dxa" w:w="2160"/>
+            <w:tcW w:type="dxa" w:w="720"/>
           </w:tcPr>
           <w:p>
+            <w:pPr>
+              <w:jc w:val="center"/>
+            </w:pPr>
             <w:r>
               <w:t>13</w:t>
             </w:r>
@@ -221,7 +243,7 @@
         </w:tc>
         <w:tc>
           <w:tcPr>
-            <w:tcW w:type="dxa" w:w="2160"/>
+            <w:tcW w:type="dxa" w:w="2592"/>
           </w:tcPr>
           <w:p>
             <w:r>
@@ -231,7 +253,7 @@
         </w:tc>
         <w:tc>
           <w:tcPr>
-            <w:tcW w:type="dxa" w:w="2160"/>
+            <w:tcW w:type="dxa" w:w="3888"/>
           </w:tcPr>
           <w:p>
             <w:r>
@@ -241,9 +263,12 @@
         </w:tc>
         <w:tc>
           <w:tcPr>
-            <w:tcW w:type="dxa" w:w="2160"/>
+            <w:tcW w:type="dxa" w:w="720"/>
           </w:tcPr>
           <w:p>
+            <w:pPr>
+              <w:jc w:val="center"/>
+            </w:pPr>
             <w:r>
               <w:t>12</w:t>
             </w:r>
@@ -263,7 +288,7 @@
         </w:tc>
         <w:tc>
           <w:tcPr>
-            <w:tcW w:type="dxa" w:w="2160"/>
+            <w:tcW w:type="dxa" w:w="2592"/>
           </w:tcPr>
           <w:p>
             <w:r>
@@ -273,7 +298,7 @@
         </w:tc>
         <w:tc>
           <w:tcPr>
-            <w:tcW w:type="dxa" w:w="2160"/>
+            <w:tcW w:type="dxa" w:w="3888"/>
           </w:tcPr>
           <w:p>
             <w:r>
@@ -283,9 +308,12 @@
         </w:tc>
         <w:tc>
           <w:tcPr>
-            <w:tcW w:type="dxa" w:w="2160"/>
+            <w:tcW w:type="dxa" w:w="720"/>
           </w:tcPr>
           <w:p>
+            <w:pPr>
+              <w:jc w:val="center"/>
+            </w:pPr>
             <w:r>
               <w:t>14</w:t>
             </w:r>

</xml_diff>

<commit_message>
Enhance logsheet generation with logo, footer, and optional PDF export
Co-authored-by: aashrikaac <aashrikaac@gmail.com>
</commit_message>
<xml_diff>
--- a/medilog/MediLog_Logsheet_Continuation.docx
+++ b/medilog/MediLog_Logsheet_Continuation.docx
@@ -45,6 +45,7 @@
         <w:tc>
           <w:tcPr>
             <w:tcW w:type="dxa" w:w="2160"/>
+            <w:shd w:fill="D9EAF7"/>
           </w:tcPr>
           <w:p>
             <w:r>
@@ -58,6 +59,7 @@
         <w:tc>
           <w:tcPr>
             <w:tcW w:type="dxa" w:w="2592"/>
+            <w:shd w:fill="D9EAF7"/>
           </w:tcPr>
           <w:p>
             <w:r>
@@ -71,6 +73,7 @@
         <w:tc>
           <w:tcPr>
             <w:tcW w:type="dxa" w:w="3888"/>
+            <w:shd w:fill="D9EAF7"/>
           </w:tcPr>
           <w:p>
             <w:r>
@@ -84,6 +87,7 @@
         <w:tc>
           <w:tcPr>
             <w:tcW w:type="dxa" w:w="720"/>
+            <w:shd w:fill="D9EAF7"/>
           </w:tcPr>
           <w:p>
             <w:r>
@@ -322,6 +326,7 @@
       </w:tr>
     </w:tbl>
     <w:sectPr>
+      <w:footerReference w:type="default" r:id="rId9"/>
       <w:pgSz w:w="12240" w:h="15840"/>
       <w:pgMar w:top="1440" w:right="1800" w:bottom="1440" w:left="1800" w:header="720" w:footer="720" w:gutter="0"/>
       <w:cols w:space="720"/>
@@ -329,6 +334,23 @@
     </w:sectPr>
   </w:body>
 </w:document>
+</file>
+
+<file path=word/footer1.xml><?xml version="1.0" encoding="utf-8"?>
+<w:ftr xmlns:m="http://schemas.openxmlformats.org/officeDocument/2006/math" xmlns:mc="http://schemas.openxmlformats.org/markup-compatibility/2006" xmlns:mo="http://schemas.microsoft.com/office/mac/office/2008/main" xmlns:mv="urn:schemas-microsoft-com:mac:vml" xmlns:o="urn:schemas-microsoft-com:office:office" xmlns:r="http://schemas.openxmlformats.org/officeDocument/2006/relationships" xmlns:v="urn:schemas-microsoft-com:vml" xmlns:w10="urn:schemas-microsoft-com:office:word" xmlns:w14="http://schemas.microsoft.com/office/word/2010/wordml" xmlns:w="http://schemas.openxmlformats.org/wordprocessingml/2006/main" xmlns:wne="http://schemas.microsoft.com/office/word/2006/wordml" xmlns:wp14="http://schemas.microsoft.com/office/word/2010/wordprocessingDrawing" xmlns:wp="http://schemas.openxmlformats.org/drawingml/2006/wordprocessingDrawing" xmlns:wpc="http://schemas.microsoft.com/office/word/2010/wordprocessingCanvas" xmlns:wpg="http://schemas.microsoft.com/office/word/2010/wordprocessingGroup" xmlns:wpi="http://schemas.microsoft.com/office/word/2010/wordprocessingInk" xmlns:wps="http://schemas.microsoft.com/office/word/2010/wordprocessingShape" mc:Ignorable="w14 wp14">
+  <w:p>
+    <w:pPr>
+      <w:pStyle w:val="Footer"/>
+      <w:jc w:val="right"/>
+    </w:pPr>
+    <w:r>
+      <w:rPr>
+        <w:sz w:val="18"/>
+      </w:rPr>
+      <w:t>MediLog • Generated on 2025-08-17 16:05</w:t>
+    </w:r>
+  </w:p>
+</w:ftr>
 </file>
 
 <file path=word/numbering.xml><?xml version="1.0" encoding="utf-8"?>

</xml_diff>